<commit_message>
Add new skill. Update Resume
</commit_message>
<xml_diff>
--- a/data/cv.docx
+++ b/data/cv.docx
@@ -300,8 +300,433 @@
         </w:rPr>
         <w:t>// TODO:</w:t>
       </w:r>
+    </w:p>
+    <w:p>
+      <w:pPr>
+        <w:rPr>
+          <w:lang w:val="en-US"/>
+        </w:rPr>
+      </w:pPr>
+      <w:r>
+        <w:rPr>
+          <w:lang w:val="en-US"/>
+        </w:rPr>
+        <w:br w:type="page"/>
+      </w:r>
+    </w:p>
+    <w:p>
+      <w:pPr>
+        <w:rPr>
+          <w:lang w:val="en-US"/>
+        </w:rPr>
+      </w:pPr>
+      <w:r>
+        <w:rPr>
+          <w:noProof/>
+          <w:lang w:val="en-US"/>
+        </w:rPr>
+        <w:lastRenderedPageBreak/>
+        <mc:AlternateContent>
+          <mc:Choice Requires="wps">
+            <w:drawing>
+              <wp:anchor distT="0" distB="0" distL="114300" distR="114300" simplePos="0" relativeHeight="251661312" behindDoc="0" locked="0" layoutInCell="1" allowOverlap="1" wp14:anchorId="3CDAFCE3" wp14:editId="38246848">
+                <wp:simplePos x="0" y="0"/>
+                <wp:positionH relativeFrom="column">
+                  <wp:posOffset>-685800</wp:posOffset>
+                </wp:positionH>
+                <wp:positionV relativeFrom="paragraph">
+                  <wp:posOffset>-733425</wp:posOffset>
+                </wp:positionV>
+                <wp:extent cx="1543050" cy="1524000"/>
+                <wp:effectExtent l="228600" t="228600" r="247650" b="247650"/>
+                <wp:wrapNone/>
+                <wp:docPr id="3" name="Rounded Rectangle 3"/>
+                <wp:cNvGraphicFramePr/>
+                <a:graphic xmlns:a="http://schemas.openxmlformats.org/drawingml/2006/main">
+                  <a:graphicData uri="http://schemas.microsoft.com/office/word/2010/wordprocessingShape">
+                    <wps:wsp>
+                      <wps:cNvSpPr/>
+                      <wps:spPr>
+                        <a:xfrm>
+                          <a:off x="0" y="0"/>
+                          <a:ext cx="1543050" cy="1524000"/>
+                        </a:xfrm>
+                        <a:prstGeom prst="roundRect">
+                          <a:avLst/>
+                        </a:prstGeom>
+                        <a:blipFill dpi="0" rotWithShape="1">
+                          <a:blip r:embed="rId8" cstate="print">
+                            <a:extLst>
+                              <a:ext uri="{28A0092B-C50C-407E-A947-70E740481C1C}">
+                                <a14:useLocalDpi xmlns:a14="http://schemas.microsoft.com/office/drawing/2010/main" val="0"/>
+                              </a:ext>
+                            </a:extLst>
+                          </a:blip>
+                          <a:srcRect/>
+                          <a:stretch>
+                            <a:fillRect/>
+                          </a:stretch>
+                        </a:blipFill>
+                        <a:ln>
+                          <a:solidFill>
+                            <a:schemeClr val="bg1"/>
+                          </a:solidFill>
+                        </a:ln>
+                        <a:effectLst>
+                          <a:glow rad="228600">
+                            <a:schemeClr val="accent3">
+                              <a:satMod val="175000"/>
+                              <a:alpha val="40000"/>
+                            </a:schemeClr>
+                          </a:glow>
+                        </a:effectLst>
+                      </wps:spPr>
+                      <wps:style>
+                        <a:lnRef idx="2">
+                          <a:schemeClr val="accent1">
+                            <a:shade val="50000"/>
+                          </a:schemeClr>
+                        </a:lnRef>
+                        <a:fillRef idx="1">
+                          <a:schemeClr val="accent1"/>
+                        </a:fillRef>
+                        <a:effectRef idx="0">
+                          <a:schemeClr val="accent1"/>
+                        </a:effectRef>
+                        <a:fontRef idx="minor">
+                          <a:schemeClr val="lt1"/>
+                        </a:fontRef>
+                      </wps:style>
+                      <wps:bodyPr rot="0" spcFirstLastPara="0" vertOverflow="overflow" horzOverflow="overflow" vert="horz" wrap="square" lIns="91440" tIns="45720" rIns="91440" bIns="45720" numCol="1" spcCol="0" rtlCol="0" fromWordArt="0" anchor="ctr" anchorCtr="0" forceAA="0" compatLnSpc="1">
+                        <a:prstTxWarp prst="textNoShape">
+                          <a:avLst/>
+                        </a:prstTxWarp>
+                        <a:noAutofit/>
+                      </wps:bodyPr>
+                    </wps:wsp>
+                  </a:graphicData>
+                </a:graphic>
+                <wp14:sizeRelH relativeFrom="margin">
+                  <wp14:pctWidth>0</wp14:pctWidth>
+                </wp14:sizeRelH>
+                <wp14:sizeRelV relativeFrom="margin">
+                  <wp14:pctHeight>0</wp14:pctHeight>
+                </wp14:sizeRelV>
+              </wp:anchor>
+            </w:drawing>
+          </mc:Choice>
+          <mc:Fallback>
+            <w:pict>
+              <v:roundrect w14:anchorId="7CE66A32" id="Rounded Rectangle 3" o:spid="_x0000_s1026" style="position:absolute;margin-left:-54pt;margin-top:-57.75pt;width:121.5pt;height:120pt;z-index:251661312;visibility:visible;mso-wrap-style:square;mso-width-percent:0;mso-height-percent:0;mso-wrap-distance-left:9pt;mso-wrap-distance-top:0;mso-wrap-distance-right:9pt;mso-wrap-distance-bottom:0;mso-position-horizontal:absolute;mso-position-horizontal-relative:text;mso-position-vertical:absolute;mso-position-vertical-relative:text;mso-width-percent:0;mso-height-percent:0;mso-width-relative:margin;mso-height-relative:margin;v-text-anchor:middle" arcsize="10923f" o:gfxdata="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" strokecolor="white [3212]" strokeweight="1pt">
+                <v:fill r:id="rId9" o:title="" recolor="t" rotate="t" type="frame"/>
+                <v:stroke joinstyle="miter"/>
+              </v:roundrect>
+            </w:pict>
+          </mc:Fallback>
+        </mc:AlternateContent>
+      </w:r>
+      <w:r>
+        <w:rPr>
+          <w:noProof/>
+          <w:lang w:val="en-US"/>
+        </w:rPr>
+        <mc:AlternateContent>
+          <mc:Choice Requires="wps">
+            <w:drawing>
+              <wp:anchor distT="0" distB="0" distL="114300" distR="114300" simplePos="0" relativeHeight="251659264" behindDoc="0" locked="0" layoutInCell="1" allowOverlap="1" wp14:anchorId="1976408B" wp14:editId="6896DB87">
+                <wp:simplePos x="0" y="0"/>
+                <wp:positionH relativeFrom="page">
+                  <wp:align>right</wp:align>
+                </wp:positionH>
+                <wp:positionV relativeFrom="paragraph">
+                  <wp:posOffset>-914400</wp:posOffset>
+                </wp:positionV>
+                <wp:extent cx="5572125" cy="2266950"/>
+                <wp:effectExtent l="0" t="0" r="9525" b="0"/>
+                <wp:wrapNone/>
+                <wp:docPr id="1" name="Rectangle 1"/>
+                <wp:cNvGraphicFramePr/>
+                <a:graphic xmlns:a="http://schemas.openxmlformats.org/drawingml/2006/main">
+                  <a:graphicData uri="http://schemas.microsoft.com/office/word/2010/wordprocessingShape">
+                    <wps:wsp>
+                      <wps:cNvSpPr/>
+                      <wps:spPr>
+                        <a:xfrm>
+                          <a:off x="0" y="0"/>
+                          <a:ext cx="5572125" cy="2266950"/>
+                        </a:xfrm>
+                        <a:prstGeom prst="rect">
+                          <a:avLst/>
+                        </a:prstGeom>
+                        <a:solidFill>
+                          <a:srgbClr val="4A6CF7"/>
+                        </a:solidFill>
+                        <a:ln>
+                          <a:noFill/>
+                        </a:ln>
+                      </wps:spPr>
+                      <wps:style>
+                        <a:lnRef idx="2">
+                          <a:schemeClr val="accent1">
+                            <a:shade val="50000"/>
+                          </a:schemeClr>
+                        </a:lnRef>
+                        <a:fillRef idx="1">
+                          <a:schemeClr val="accent1"/>
+                        </a:fillRef>
+                        <a:effectRef idx="0">
+                          <a:schemeClr val="accent1"/>
+                        </a:effectRef>
+                        <a:fontRef idx="minor">
+                          <a:schemeClr val="lt1"/>
+                        </a:fontRef>
+                      </wps:style>
+                      <wps:txbx>
+                        <w:txbxContent>
+                          <w:p>
+                            <w:pPr>
+                              <w:spacing w:line="720" w:lineRule="auto"/>
+                              <w:rPr>
+                                <w:sz w:val="64"/>
+                                <w:szCs w:val="64"/>
+                                <w:lang w:val="en-US"/>
+                              </w:rPr>
+                            </w:pPr>
+                            <w:r>
+                              <w:rPr>
+                                <w:sz w:val="64"/>
+                                <w:szCs w:val="64"/>
+                                <w:lang w:val="en-US"/>
+                              </w:rPr>
+                              <w:t>PEPPLE PROSPER SODIARI</w:t>
+                            </w:r>
+                          </w:p>
+                          <w:p>
+                            <w:pPr>
+                              <w:spacing w:line="720" w:lineRule="auto"/>
+                              <w:rPr>
+                                <w:sz w:val="64"/>
+                                <w:szCs w:val="64"/>
+                                <w:lang w:val="en-US"/>
+                              </w:rPr>
+                            </w:pPr>
+                          </w:p>
+                          <w:p>
+                            <w:pPr>
+                              <w:spacing w:line="720" w:lineRule="auto"/>
+                            </w:pPr>
+                          </w:p>
+                        </w:txbxContent>
+                      </wps:txbx>
+                      <wps:bodyPr rot="0" spcFirstLastPara="0" vertOverflow="overflow" horzOverflow="overflow" vert="horz" wrap="square" lIns="91440" tIns="45720" rIns="91440" bIns="45720" numCol="1" spcCol="0" rtlCol="0" fromWordArt="0" anchor="ctr" anchorCtr="0" forceAA="0" compatLnSpc="1">
+                        <a:prstTxWarp prst="textNoShape">
+                          <a:avLst/>
+                        </a:prstTxWarp>
+                        <a:noAutofit/>
+                      </wps:bodyPr>
+                    </wps:wsp>
+                  </a:graphicData>
+                </a:graphic>
+                <wp14:sizeRelH relativeFrom="margin">
+                  <wp14:pctWidth>0</wp14:pctWidth>
+                </wp14:sizeRelH>
+                <wp14:sizeRelV relativeFrom="margin">
+                  <wp14:pctHeight>0</wp14:pctHeight>
+                </wp14:sizeRelV>
+              </wp:anchor>
+            </w:drawing>
+          </mc:Choice>
+          <mc:Fallback>
+            <w:pict>
+              <v:rect w14:anchorId="1976408B" id="Rectangle 1" o:spid="_x0000_s1026" style="position:absolute;margin-left:387.55pt;margin-top:-1in;width:438.75pt;height:178.5pt;z-index:251659264;visibility:visible;mso-wrap-style:square;mso-width-percent:0;mso-height-percent:0;mso-wrap-distance-left:9pt;mso-wrap-distance-top:0;mso-wrap-distance-right:9pt;mso-wrap-distance-bottom:0;mso-position-horizontal:right;mso-position-horizontal-relative:page;mso-position-vertical:absolute;mso-position-vertical-relative:text;mso-width-percent:0;mso-height-percent:0;mso-width-relative:margin;mso-height-relative:margin;v-text-anchor:middle" o:gfxdata="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" fillcolor="#4a6cf7" stroked="f" strokeweight="1pt">
+                <v:textbox>
+                  <w:txbxContent>
+                    <w:p>
+                      <w:pPr>
+                        <w:spacing w:line="720" w:lineRule="auto"/>
+                        <w:rPr>
+                          <w:sz w:val="64"/>
+                          <w:szCs w:val="64"/>
+                          <w:lang w:val="en-US"/>
+                        </w:rPr>
+                      </w:pPr>
+                      <w:r>
+                        <w:rPr>
+                          <w:sz w:val="64"/>
+                          <w:szCs w:val="64"/>
+                          <w:lang w:val="en-US"/>
+                        </w:rPr>
+                        <w:t>PEPPLE PROSPER SODIARI</w:t>
+                      </w:r>
+                    </w:p>
+                    <w:p>
+                      <w:pPr>
+                        <w:spacing w:line="720" w:lineRule="auto"/>
+                        <w:rPr>
+                          <w:sz w:val="64"/>
+                          <w:szCs w:val="64"/>
+                          <w:lang w:val="en-US"/>
+                        </w:rPr>
+                      </w:pPr>
+                    </w:p>
+                    <w:p>
+                      <w:pPr>
+                        <w:spacing w:line="720" w:lineRule="auto"/>
+                      </w:pPr>
+                    </w:p>
+                  </w:txbxContent>
+                </v:textbox>
+                <w10:wrap anchorx="page"/>
+              </v:rect>
+            </w:pict>
+          </mc:Fallback>
+        </mc:AlternateContent>
+      </w:r>
+      <w:r>
+        <w:rPr>
+          <w:noProof/>
+          <w:lang w:val="en-US"/>
+        </w:rPr>
+        <mc:AlternateContent>
+          <mc:Choice Requires="wps">
+            <w:drawing>
+              <wp:anchor distT="0" distB="0" distL="114300" distR="114300" simplePos="0" relativeHeight="251660288" behindDoc="0" locked="0" layoutInCell="1" allowOverlap="1" wp14:anchorId="444B160A" wp14:editId="0F994F02">
+                <wp:simplePos x="0" y="0"/>
+                <wp:positionH relativeFrom="column">
+                  <wp:posOffset>-904875</wp:posOffset>
+                </wp:positionH>
+                <wp:positionV relativeFrom="paragraph">
+                  <wp:posOffset>-942975</wp:posOffset>
+                </wp:positionV>
+                <wp:extent cx="2190750" cy="10086975"/>
+                <wp:effectExtent l="0" t="0" r="0" b="9525"/>
+                <wp:wrapNone/>
+                <wp:docPr id="2" name="Rectangle 2"/>
+                <wp:cNvGraphicFramePr/>
+                <a:graphic xmlns:a="http://schemas.openxmlformats.org/drawingml/2006/main">
+                  <a:graphicData uri="http://schemas.microsoft.com/office/word/2010/wordprocessingShape">
+                    <wps:wsp>
+                      <wps:cNvSpPr/>
+                      <wps:spPr>
+                        <a:xfrm>
+                          <a:off x="0" y="0"/>
+                          <a:ext cx="2190750" cy="10086975"/>
+                        </a:xfrm>
+                        <a:prstGeom prst="rect">
+                          <a:avLst/>
+                        </a:prstGeom>
+                        <a:solidFill>
+                          <a:srgbClr val="E8E7F5"/>
+                        </a:solidFill>
+                        <a:ln>
+                          <a:noFill/>
+                        </a:ln>
+                      </wps:spPr>
+                      <wps:style>
+                        <a:lnRef idx="2">
+                          <a:schemeClr val="accent1">
+                            <a:shade val="50000"/>
+                          </a:schemeClr>
+                        </a:lnRef>
+                        <a:fillRef idx="1">
+                          <a:schemeClr val="accent1"/>
+                        </a:fillRef>
+                        <a:effectRef idx="0">
+                          <a:schemeClr val="accent1"/>
+                        </a:effectRef>
+                        <a:fontRef idx="minor">
+                          <a:schemeClr val="lt1"/>
+                        </a:fontRef>
+                      </wps:style>
+                      <wps:bodyPr rot="0" spcFirstLastPara="0" vertOverflow="overflow" horzOverflow="overflow" vert="horz" wrap="square" lIns="91440" tIns="45720" rIns="91440" bIns="45720" numCol="1" spcCol="0" rtlCol="0" fromWordArt="0" anchor="ctr" anchorCtr="0" forceAA="0" compatLnSpc="1">
+                        <a:prstTxWarp prst="textNoShape">
+                          <a:avLst/>
+                        </a:prstTxWarp>
+                        <a:noAutofit/>
+                      </wps:bodyPr>
+                    </wps:wsp>
+                  </a:graphicData>
+                </a:graphic>
+                <wp14:sizeRelH relativeFrom="margin">
+                  <wp14:pctWidth>0</wp14:pctWidth>
+                </wp14:sizeRelH>
+                <wp14:sizeRelV relativeFrom="margin">
+                  <wp14:pctHeight>0</wp14:pctHeight>
+                </wp14:sizeRelV>
+              </wp:anchor>
+            </w:drawing>
+          </mc:Choice>
+          <mc:Fallback>
+            <w:pict>
+              <v:rect w14:anchorId="1B0BE15A" id="Rectangle 2" o:spid="_x0000_s1026" style="position:absolute;margin-left:-71.25pt;margin-top:-74.25pt;width:172.5pt;height:794.25pt;z-index:251660288;visibility:visible;mso-wrap-style:square;mso-width-percent:0;mso-height-percent:0;mso-wrap-distance-left:9pt;mso-wrap-distance-top:0;mso-wrap-distance-right:9pt;mso-wrap-distance-bottom:0;mso-position-horizontal:absolute;mso-position-horizontal-relative:text;mso-position-vertical:absolute;mso-position-vertical-relative:text;mso-width-percent:0;mso-height-percent:0;mso-width-relative:margin;mso-height-relative:margin;v-text-anchor:middle" o:gfxdata="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" fillcolor="#e8e7f5" stroked="f" strokeweight="1pt"/>
+            </w:pict>
+          </mc:Fallback>
+        </mc:AlternateContent>
+      </w:r>
+    </w:p>
+    <w:p>
+      <w:pPr>
+        <w:rPr>
+          <w:lang w:val="en-US"/>
+        </w:rPr>
+      </w:pPr>
+    </w:p>
+    <w:p>
+      <w:pPr>
+        <w:rPr>
+          <w:lang w:val="en-US"/>
+        </w:rPr>
+      </w:pPr>
+    </w:p>
+    <w:p>
+      <w:pPr>
+        <w:rPr>
+          <w:lang w:val="en-US"/>
+        </w:rPr>
+      </w:pPr>
+    </w:p>
+    <w:p>
+      <w:pPr>
+        <w:rPr>
+          <w:lang w:val="en-US"/>
+        </w:rPr>
+      </w:pPr>
+    </w:p>
+    <w:p>
+      <w:pPr>
+        <w:rPr>
+          <w:lang w:val="en-US"/>
+        </w:rPr>
+      </w:pPr>
       <w:bookmarkStart w:id="0" w:name="_GoBack"/>
       <w:bookmarkEnd w:id="0"/>
+    </w:p>
+    <w:p>
+      <w:pPr>
+        <w:rPr>
+          <w:lang w:val="en-US"/>
+        </w:rPr>
+      </w:pPr>
+    </w:p>
+    <w:p>
+      <w:pPr>
+        <w:rPr>
+          <w:lang w:val="en-US"/>
+        </w:rPr>
+      </w:pPr>
+    </w:p>
+    <w:p>
+      <w:pPr>
+        <w:rPr>
+          <w:lang w:val="en-US"/>
+        </w:rPr>
+      </w:pPr>
+      <w:r>
+        <w:rPr>
+          <w:lang w:val="en-US"/>
+        </w:rPr>
+        <w:tab/>
+      </w:r>
     </w:p>
     <w:sectPr>
       <w:pgSz w:w="12240" w:h="15840"/>
@@ -706,7 +1131,7 @@
   <w:style w:type="paragraph" w:default="1" w:styleId="Normal">
     <w:name w:val="Normal"/>
     <w:qFormat/>
-    <w:rsid w:val="00B91D7B"/>
+    <w:rsid w:val="00C34345"/>
     <w:rPr>
       <w:lang w:val="en-GB"/>
     </w:rPr>

</xml_diff>